<commit_message>
docx , arranjado parte da cominucaçao serie/web
</commit_message>
<xml_diff>
--- a/SISTCA_2025-26_3DE_TEAM5__DOMÓTICA ESP32_ (1).docx
+++ b/SISTCA_2025-26_3DE_TEAM5__DOMÓTICA ESP32_ (1).docx
@@ -969,6 +969,13 @@
     </w:p>
     <w:sdt>
       <w:sdtPr>
+        <w:rPr>
+          <w:rFonts w:ascii="Verdana" w:eastAsia="Verdana" w:hAnsi="Verdana" w:cs="Verdana"/>
+          <w:color w:val="auto"/>
+          <w:sz w:val="20"/>
+          <w:szCs w:val="20"/>
+          <w:lang w:val="en-GB"/>
+        </w:rPr>
         <w:id w:val="1827699558"/>
         <w:docPartObj>
           <w:docPartGallery w:val="Table of Contents"/>
@@ -977,13 +984,8 @@
       </w:sdtPr>
       <w:sdtEndPr>
         <w:rPr>
-          <w:rFonts w:ascii="Verdana" w:eastAsia="Verdana" w:hAnsi="Verdana" w:cs="Verdana"/>
           <w:b/>
           <w:bCs/>
-          <w:color w:val="auto"/>
-          <w:sz w:val="20"/>
-          <w:szCs w:val="20"/>
-          <w:lang w:val="en-GB"/>
         </w:rPr>
       </w:sdtEndPr>
       <w:sdtContent>
@@ -1698,6 +1700,9 @@
     <w:p>
       <w:pPr>
         <w:pStyle w:val="Ttulo1"/>
+        <w:rPr>
+          <w:lang w:val="pt-PT"/>
+        </w:rPr>
       </w:pPr>
       <w:r>
         <w:rPr>
@@ -1717,45 +1722,35 @@
         </w:rPr>
         <w:t xml:space="preserve">.   </w:t>
       </w:r>
-      <w:proofErr w:type="spellStart"/>
       <w:r>
         <w:rPr>
           <w:sz w:val="28"/>
           <w:szCs w:val="28"/>
+          <w:lang w:val="pt-PT"/>
         </w:rPr>
         <w:t>Introdução</w:t>
       </w:r>
-      <w:proofErr w:type="spellEnd"/>
     </w:p>
     <w:p>
       <w:pPr>
         <w:pStyle w:val="Ttulo2"/>
-      </w:pPr>
-      <w:r>
+        <w:rPr>
+          <w:lang w:val="pt-PT"/>
+        </w:rPr>
+      </w:pPr>
+      <w:r>
+        <w:rPr>
+          <w:lang w:val="pt-PT"/>
+        </w:rPr>
         <w:t xml:space="preserve">1.1 </w:t>
       </w:r>
       <w:hyperlink w:anchor="_uvw1vtaudlsr">
-        <w:proofErr w:type="spellStart"/>
         <w:r>
-          <w:t>Contexto</w:t>
+          <w:rPr>
+            <w:lang w:val="pt-PT"/>
+          </w:rPr>
+          <w:t>Contexto Científico/Tecnológico</w:t>
         </w:r>
-        <w:proofErr w:type="spellEnd"/>
-        <w:r>
-          <w:t xml:space="preserve"> </w:t>
-        </w:r>
-        <w:proofErr w:type="spellStart"/>
-        <w:r>
-          <w:t>Científico</w:t>
-        </w:r>
-        <w:proofErr w:type="spellEnd"/>
-        <w:r>
-          <w:t>/</w:t>
-        </w:r>
-        <w:proofErr w:type="spellStart"/>
-        <w:r>
-          <w:t>Tecnológico</w:t>
-        </w:r>
-        <w:proofErr w:type="spellEnd"/>
       </w:hyperlink>
     </w:p>
     <w:p>
@@ -1768,13 +1763,7 @@
         <w:rPr>
           <w:lang w:val="pt-PT"/>
         </w:rPr>
-        <w:t>Os microcontroladores são amplamente utilizados no controlo de dispositivos eletrónicos e sistemas de automação. O ESP32 é uma plataforma versátil que permite controlar diferentes componentes através de sinais digitais e comunicação serial. Neste trabalho,</w:t>
-      </w:r>
-      <w:r>
-        <w:rPr>
-          <w:lang w:val="pt-PT"/>
-        </w:rPr>
-        <w:t xml:space="preserve"> o ESP32 é utilizado para controlar um motor DC através de comandos enviados por um terminal, permitindo ligar ou desligar o motor de forma simples.</w:t>
+        <w:t>Os microcontroladores são amplamente utilizados no controlo de dispositivos eletrónicos e sistemas de automação. O ESP32 é uma plataforma versátil que permite controlar diferentes componentes através de sinais digitais e comunicação serial. Neste trabalho, o ESP32 é utilizado para controlar um motor DC através de comandos enviados por um terminal, permitindo ligar ou desligar o motor de forma simples.</w:t>
       </w:r>
     </w:p>
     <w:p>
@@ -1820,19 +1809,7 @@
         <w:rPr>
           <w:lang w:val="pt-PT"/>
         </w:rPr>
-        <w:t>A realização deste proje</w:t>
-      </w:r>
-      <w:r>
-        <w:rPr>
-          <w:lang w:val="pt-PT"/>
-        </w:rPr>
-        <w:t>to surge do interesse em explorar o funcionamento de microcontroladores e o controlo de dispositivos eletrónicos. Para além disso, trata-se de um trabalho com uma abordagem diferente de projetos anteriormente realizados, permitindo aplicar e consolidar con</w:t>
-      </w:r>
-      <w:r>
-        <w:rPr>
-          <w:lang w:val="pt-PT"/>
-        </w:rPr>
-        <w:t>hecimentos relacionados com eletrónica e programação através da utilização do microcontrolador ESP32.</w:t>
+        <w:t>A realização deste projeto surge do interesse em explorar o funcionamento de microcontroladores e o controlo de dispositivos eletrónicos. Para além disso, trata-se de um trabalho com uma abordagem diferente de projetos anteriormente realizados, permitindo aplicar e consolidar conhecimentos relacionados com eletrónica e programação através da utilização do microcontrolador ESP32.</w:t>
       </w:r>
     </w:p>
     <w:p>
@@ -1885,19 +1862,7 @@
         <w:rPr>
           <w:lang w:val="pt-PT"/>
         </w:rPr>
-        <w:t>O principal objetivo deste trabalho é desenvolver um sistema simples de contr</w:t>
-      </w:r>
-      <w:r>
-        <w:rPr>
-          <w:lang w:val="pt-PT"/>
-        </w:rPr>
-        <w:t>olo de um motor DC utilizando o microcontrolador ESP32. Pretende-se implementar a comunicação através de um terminal para enviar comandos ao microcontrolador, permitindo controlar o funcionamento do motor. Adicionalmente, o projeto visa compreender o funci</w:t>
-      </w:r>
-      <w:r>
-        <w:rPr>
-          <w:lang w:val="pt-PT"/>
-        </w:rPr>
-        <w:t>onamento das entradas e saídas digitais e a interação entre hardware e software num sistema eletrónico.</w:t>
+        <w:t>O principal objetivo deste trabalho é desenvolver um sistema simples de controlo de um motor DC utilizando o microcontrolador ESP32. Pretende-se implementar a comunicação através de um terminal para enviar comandos ao microcontrolador, permitindo controlar o funcionamento do motor. Adicionalmente, o projeto visa compreender o funcionamento das entradas e saídas digitais e a interação entre hardware e software num sistema eletrónico.</w:t>
       </w:r>
     </w:p>
     <w:p>
@@ -1943,13 +1908,7 @@
         <w:rPr>
           <w:lang w:val="pt-PT"/>
         </w:rPr>
-        <w:t xml:space="preserve">Este relatório encontra-se organizado em diferentes secções. Inicialmente é </w:t>
-      </w:r>
-      <w:r>
-        <w:rPr>
-          <w:lang w:val="pt-PT"/>
-        </w:rPr>
-        <w:t xml:space="preserve">apresentado o contexto científico e tecnológico do projeto, bem como a motivação e os objetivos do trabalho. Seguidamente </w:t>
+        <w:t xml:space="preserve">Este relatório encontra-se organizado em diferentes secções. Inicialmente é apresentado o contexto científico e tecnológico do projeto, bem como a motivação e os objetivos do trabalho. Seguidamente </w:t>
       </w:r>
       <w:proofErr w:type="gramStart"/>
       <w:r>
@@ -1963,13 +1922,7 @@
         <w:rPr>
           <w:lang w:val="pt-PT"/>
         </w:rPr>
-        <w:t xml:space="preserve"> apresentado o enquadramento teórico e a descrição da tecnologia utilizada. Posteriormente são descritos o funcionamento do sistema e</w:t>
-      </w:r>
-      <w:r>
-        <w:rPr>
-          <w:lang w:val="pt-PT"/>
-        </w:rPr>
-        <w:t xml:space="preserve"> os exercícios realizados. Por fim, apresentam-se as conclusões e as referências utilizadas.</w:t>
+        <w:t xml:space="preserve"> apresentado o enquadramento teórico e a descrição da tecnologia utilizada. Posteriormente são descritos o funcionamento do sistema e os exercícios realizados. Por fim, apresentam-se as conclusões e as referências utilizadas.</w:t>
       </w:r>
     </w:p>
     <w:p>
@@ -2114,13 +2067,7 @@
         <w:rPr>
           <w:lang w:val="pt-PT"/>
         </w:rPr>
-        <w:t>Os microcontroladores são amplamente utilizados em sistemas eletrónicos para controlar dispositivos e realizar diferentes tarefas através de programação. O ESP32 é um microcontrolador bastante utilizado devido à</w:t>
-      </w:r>
-      <w:r>
-        <w:rPr>
-          <w:lang w:val="pt-PT"/>
-        </w:rPr>
-        <w:t xml:space="preserve"> sua capacidade de processamento, versatilidade e facilidade de integração com diferentes componentes eletrónicos.</w:t>
+        <w:t>Os microcontroladores são amplamente utilizados em sistemas eletrónicos para controlar dispositivos e realizar diferentes tarefas através de programação. O ESP32 é um microcontrolador bastante utilizado devido à sua capacidade de processamento, versatilidade e facilidade de integração com diferentes componentes eletrónicos.</w:t>
       </w:r>
     </w:p>
     <w:p>
@@ -2159,19 +2106,7 @@
         <w:rPr>
           <w:lang w:val="pt-PT"/>
         </w:rPr>
-        <w:t>, um ambiente de desenvolvimento que permite escrever, compilar e carregar có</w:t>
-      </w:r>
-      <w:r>
-        <w:rPr>
-          <w:lang w:val="pt-PT"/>
-        </w:rPr>
-        <w:t>digo para o microcontrolador de forma simples. Este ambiente disponibiliza diversas bibliotecas que facilitam a implementação de funcionalidades, permitindo ao utilizador controlar entradas e saídas digitais, comunicar através de interfaces seriais e inter</w:t>
-      </w:r>
-      <w:r>
-        <w:rPr>
-          <w:lang w:val="pt-PT"/>
-        </w:rPr>
-        <w:t>agir com diferentes dispositivos.</w:t>
+        <w:t>, um ambiente de desenvolvimento que permite escrever, compilar e carregar código para o microcontrolador de forma simples. Este ambiente disponibiliza diversas bibliotecas que facilitam a implementação de funcionalidades, permitindo ao utilizador controlar entradas e saídas digitais, comunicar através de interfaces seriais e interagir com diferentes dispositivos.</w:t>
       </w:r>
     </w:p>
     <w:p>
@@ -2185,13 +2120,7 @@
         <w:rPr>
           <w:lang w:val="pt-PT"/>
         </w:rPr>
-        <w:t>No contexto deste projeto, o ESP32 é utilizado para controlar um motor DC através de comandos enviados por um terminal. A comunicação serial permite ao utilizador enviar instruções diretamente ao microcontrolador, que inte</w:t>
-      </w:r>
-      <w:r>
-        <w:rPr>
-          <w:lang w:val="pt-PT"/>
-        </w:rPr>
-        <w:t>rpreta esses comandos e executa as ações correspondentes, como ligar ou desligar o motor. Esta abordagem permite compreender a interação entre software e hardware em sistemas eletrónicos baseados em microcontroladores.</w:t>
+        <w:t>No contexto deste projeto, o ESP32 é utilizado para controlar um motor DC através de comandos enviados por um terminal. A comunicação serial permite ao utilizador enviar instruções diretamente ao microcontrolador, que interpreta esses comandos e executa as ações correspondentes, como ligar ou desligar o motor. Esta abordagem permite compreender a interação entre software e hardware em sistemas eletrónicos baseados em microcontroladores.</w:t>
       </w:r>
     </w:p>
     <w:p>
@@ -2312,19 +2241,7 @@
         <w:rPr>
           <w:lang w:val="pt-PT"/>
         </w:rPr>
-        <w:t>Atualmente, os microcontroladores são amplamente utilizados no controlo de diferentes dispositivos eletrónicos. Plataformas como o ESP32</w:t>
-      </w:r>
-      <w:r>
-        <w:rPr>
-          <w:lang w:val="pt-PT"/>
-        </w:rPr>
-        <w:t xml:space="preserve"> permitem desenvolver sistemas simples de controlo através de programação e comunicação com o utilizador. Neste contexto, o sistema desenvolvido baseia-se na utilização do ESP32 para controlar um motor DC através de comandos enviados por um terminal, sendo</w:t>
-      </w:r>
-      <w:r>
-        <w:rPr>
-          <w:lang w:val="pt-PT"/>
-        </w:rPr>
-        <w:t xml:space="preserve"> também utilizado um LED como indicador do estado de funcionamento do sistema, conforme ilustrado no diagrama de blocos apresentado.</w:t>
+        <w:t>Atualmente, os microcontroladores são amplamente utilizados no controlo de diferentes dispositivos eletrónicos. Plataformas como o ESP32 permitem desenvolver sistemas simples de controlo através de programação e comunicação com o utilizador. Neste contexto, o sistema desenvolvido baseia-se na utilização do ESP32 para controlar um motor DC através de comandos enviados por um terminal, sendo também utilizado um LED como indicador do estado de funcionamento do sistema, conforme ilustrado no diagrama de blocos apresentado.</w:t>
       </w:r>
     </w:p>
     <w:p>
@@ -2382,14 +2299,19 @@
       </w:r>
       <w:proofErr w:type="gramEnd"/>
       <w:r>
-        <w:t xml:space="preserve"> a snapshot of th</w:t>
-      </w:r>
-      <w:r>
-        <w:t>e main characteristics/functionality of the technology described in this lab script)</w:t>
-      </w:r>
-    </w:p>
-    <w:p>
-      <w:r>
+        <w:t xml:space="preserve"> a snapshot of the main characteristics/functionality of the technology described in this lab script)</w:t>
+      </w:r>
+    </w:p>
+    <w:p>
+      <w:pPr>
+        <w:rPr>
+          <w:lang w:val="pt-PT"/>
+        </w:rPr>
+      </w:pPr>
+      <w:r>
+        <w:rPr>
+          <w:lang w:val="pt-PT"/>
+        </w:rPr>
         <w:t>3.1</w:t>
       </w:r>
       <w:r>
@@ -2397,47 +2319,27 @@
           <w:b/>
           <w:bCs/>
           <w:color w:val="000000"/>
+          <w:lang w:val="pt-PT"/>
         </w:rPr>
         <w:t xml:space="preserve"> </w:t>
       </w:r>
       <w:hyperlink w:anchor="_t88pjzm8l28d">
-        <w:proofErr w:type="spellStart"/>
         <w:r>
           <w:rPr>
             <w:b/>
             <w:bCs/>
+            <w:lang w:val="pt-PT"/>
           </w:rPr>
-          <w:t>Configuração</w:t>
-        </w:r>
-        <w:proofErr w:type="spellEnd"/>
-        <w:r>
-          <w:rPr>
-            <w:b/>
-            <w:bCs/>
-          </w:rPr>
-          <w:t>/</w:t>
-        </w:r>
-        <w:proofErr w:type="spellStart"/>
-        <w:r>
-          <w:rPr>
-            <w:b/>
-            <w:bCs/>
-          </w:rPr>
-          <w:t>Instalação</w:t>
-        </w:r>
-        <w:proofErr w:type="spellEnd"/>
-        <w:r>
-          <w:rPr>
-            <w:b/>
-            <w:bCs/>
-          </w:rPr>
-          <w:t xml:space="preserve"> (Software/Hardware)</w:t>
+          <w:t>Configuração/Instalação (Software/Hardware)</w:t>
         </w:r>
       </w:hyperlink>
     </w:p>
     <w:p>
       <w:pPr>
         <w:spacing w:before="80" w:after="80"/>
+        <w:rPr>
+          <w:lang w:val="pt-PT"/>
+        </w:rPr>
       </w:pPr>
       <w:r>
         <w:rPr>
@@ -2446,30 +2348,9 @@
           <w:bCs/>
           <w:sz w:val="22"/>
           <w:szCs w:val="22"/>
-        </w:rPr>
-        <w:t xml:space="preserve">Hardware </w:t>
-      </w:r>
-      <w:proofErr w:type="spellStart"/>
-      <w:r>
-        <w:rPr>
-          <w:rFonts w:ascii="Arial" w:eastAsia="Arial" w:hAnsi="Arial" w:cs="Arial"/>
-          <w:b/>
-          <w:bCs/>
-          <w:sz w:val="22"/>
-          <w:szCs w:val="22"/>
-        </w:rPr>
-        <w:t>necessário</w:t>
-      </w:r>
-      <w:proofErr w:type="spellEnd"/>
-      <w:r>
-        <w:rPr>
-          <w:rFonts w:ascii="Arial" w:eastAsia="Arial" w:hAnsi="Arial" w:cs="Arial"/>
-          <w:b/>
-          <w:bCs/>
-          <w:sz w:val="22"/>
-          <w:szCs w:val="22"/>
-        </w:rPr>
-        <w:t>:</w:t>
+          <w:lang w:val="pt-PT"/>
+        </w:rPr>
+        <w:t>Hardware necessário:</w:t>
       </w:r>
     </w:p>
     <w:p>
@@ -2496,7 +2377,22 @@
         <w:spacing w:before="60" w:after="60"/>
       </w:pPr>
       <w:r>
-        <w:t>LED (ligado ao pino GPIO 22, com resistência para limitar a corrente)</w:t>
+        <w:t>LED ligado ao pino GPIO 22, com</w:t>
+      </w:r>
+      <w:r>
+        <w:t xml:space="preserve"> uma</w:t>
+      </w:r>
+      <w:r>
+        <w:t xml:space="preserve"> resistência </w:t>
+      </w:r>
+      <w:r>
+        <w:t xml:space="preserve">em série </w:t>
+      </w:r>
+      <w:r>
+        <w:t>para limitar a corrente</w:t>
+      </w:r>
+      <w:r>
+        <w:t xml:space="preserve"> (tipicamente 1kΩ)</w:t>
       </w:r>
     </w:p>
     <w:p>
@@ -2713,13 +2609,37 @@
           <w:szCs w:val="22"/>
           <w:lang w:val="pt-PT"/>
         </w:rPr>
-        <w:t>Ligar o ânodo do LED ao pino GPIO 22 do ESP32 através de uma resistência de 220 Ohm</w:t>
-      </w:r>
-      <w:r>
-        <w:rPr>
-          <w:lang w:val="pt-PT"/>
-        </w:rPr>
-        <w:t xml:space="preserve"> (em série)</w:t>
+        <w:t xml:space="preserve">Ligar o ânodo do LED ao pino GPIO 22 do ESP32 através de </w:t>
+      </w:r>
+      <w:r>
+        <w:rPr>
+          <w:rFonts w:ascii="Arial" w:eastAsia="Arial" w:hAnsi="Arial" w:cs="Arial"/>
+          <w:sz w:val="22"/>
+          <w:szCs w:val="22"/>
+          <w:lang w:val="pt-PT"/>
+        </w:rPr>
+        <w:t xml:space="preserve">uma resistência de </w:t>
+      </w:r>
+      <w:r>
+        <w:rPr>
+          <w:rFonts w:ascii="Arial" w:hAnsi="Arial" w:cs="Arial"/>
+          <w:sz w:val="22"/>
+          <w:szCs w:val="22"/>
+          <w:lang w:val="pt-PT"/>
+        </w:rPr>
+        <w:t>1kΩ</w:t>
+      </w:r>
+      <w:r>
+        <w:rPr>
+          <w:lang w:val="pt-PT"/>
+        </w:rPr>
+        <w:t xml:space="preserve"> </w:t>
+      </w:r>
+      <w:r>
+        <w:rPr>
+          <w:lang w:val="pt-PT"/>
+        </w:rPr>
+        <w:t>(em série)</w:t>
       </w:r>
       <w:r>
         <w:rPr>
@@ -3006,6 +2926,7 @@
           <w:b/>
           <w:bCs/>
           <w:color w:val="000000"/>
+          <w:lang w:val="pt-PT"/>
         </w:rPr>
       </w:pPr>
       <w:r>
@@ -3027,31 +2948,14 @@
         <w:t xml:space="preserve"> </w:t>
       </w:r>
       <w:hyperlink w:anchor="_4nnc89wbtkf">
-        <w:proofErr w:type="spellStart"/>
         <w:r>
           <w:rPr>
             <w:b/>
             <w:bCs/>
+            <w:lang w:val="pt-PT"/>
           </w:rPr>
-          <w:t>Primeiros</w:t>
+          <w:t>Primeiros passos</w:t>
         </w:r>
-        <w:proofErr w:type="spellEnd"/>
-        <w:r>
-          <w:rPr>
-            <w:b/>
-            <w:bCs/>
-          </w:rPr>
-          <w:t xml:space="preserve"> </w:t>
-        </w:r>
-        <w:proofErr w:type="spellStart"/>
-        <w:r>
-          <w:rPr>
-            <w:b/>
-            <w:bCs/>
-          </w:rPr>
-          <w:t>passos</w:t>
-        </w:r>
-        <w:proofErr w:type="spellEnd"/>
       </w:hyperlink>
     </w:p>
     <w:p>
@@ -3240,8 +3144,19 @@
         <w:spacing w:before="60" w:after="60"/>
       </w:pPr>
       <w:r>
-        <w:t>Abrir o Serial Monitor (9600 baud) para verificar o IP do AP: o ESP32 imprime o endereço IP ao iniciar.</w:t>
-      </w:r>
+        <w:t xml:space="preserve">Abrir o Serial Monitor (9600 baud) para verificar o IP do AP: o ESP32 imprime o endereço IP ao </w:t>
+      </w:r>
+      <w:proofErr w:type="gramStart"/>
+      <w:r>
+        <w:t>iniciar</w:t>
+      </w:r>
+      <w:r>
+        <w:t xml:space="preserve"> </w:t>
+      </w:r>
+      <w:r>
+        <w:t>.</w:t>
+      </w:r>
+      <w:proofErr w:type="gramEnd"/>
     </w:p>
     <w:p>
       <w:pPr>
@@ -3347,11 +3262,6 @@
       <w:pPr>
         <w:spacing w:before="80" w:after="80"/>
         <w:rPr>
-          <w:lang w:val="pt-PT"/>
-        </w:rPr>
-      </w:pPr>
-      <w:r>
-        <w:rPr>
           <w:rFonts w:ascii="Arial" w:eastAsia="Arial" w:hAnsi="Arial" w:cs="Arial"/>
           <w:b/>
           <w:bCs/>
@@ -3359,7 +3269,144 @@
           <w:szCs w:val="22"/>
           <w:lang w:val="pt-PT"/>
         </w:rPr>
+      </w:pPr>
+      <w:r>
+        <w:rPr>
+          <w:rFonts w:ascii="Arial" w:eastAsia="Arial" w:hAnsi="Arial" w:cs="Arial"/>
+          <w:b/>
+          <w:bCs/>
+          <w:sz w:val="22"/>
+          <w:szCs w:val="22"/>
+          <w:lang w:val="pt-PT"/>
+        </w:rPr>
         <w:t>Passo 3 - Testar a comunicação série:</w:t>
+      </w:r>
+    </w:p>
+    <w:p>
+      <w:pPr>
+        <w:spacing w:before="80" w:after="80"/>
+        <w:rPr>
+          <w:lang w:val="pt-PT"/>
+        </w:rPr>
+      </w:pPr>
+      <w:r>
+        <w:rPr>
+          <w:lang w:val="pt-PT"/>
+        </w:rPr>
+        <w:t xml:space="preserve">Na linha de </w:t>
+      </w:r>
+      <w:r>
+        <w:rPr>
+          <w:lang w:val="pt-PT"/>
+        </w:rPr>
+        <w:t>comandos</w:t>
+      </w:r>
+      <w:r>
+        <w:rPr>
+          <w:lang w:val="pt-PT"/>
+        </w:rPr>
+        <w:t xml:space="preserve"> t</w:t>
+      </w:r>
+      <w:r>
+        <w:rPr>
+          <w:lang w:val="pt-PT"/>
+        </w:rPr>
+        <w:t xml:space="preserve">emos o -s para definir a saída em seguida, no exemplo em </w:t>
+      </w:r>
+      <w:r>
+        <w:rPr>
+          <w:lang w:val="pt-PT"/>
+        </w:rPr>
+        <w:t>baixo</w:t>
+      </w:r>
+      <w:r>
+        <w:rPr>
+          <w:lang w:val="pt-PT"/>
+        </w:rPr>
+        <w:t xml:space="preserve"> é “led” e -m </w:t>
+      </w:r>
+      <w:r>
+        <w:rPr>
+          <w:lang w:val="pt-PT"/>
+        </w:rPr>
+        <w:t xml:space="preserve">é </w:t>
+      </w:r>
+      <w:r>
+        <w:rPr>
+          <w:lang w:val="pt-PT"/>
+        </w:rPr>
+        <w:t xml:space="preserve">para mudar o estado. Ao colocar -t, inverte o estado </w:t>
+      </w:r>
+      <w:r>
+        <w:rPr>
+          <w:lang w:val="pt-PT"/>
+        </w:rPr>
+        <w:t>da saída.</w:t>
+      </w:r>
+    </w:p>
+    <w:p>
+      <w:pPr>
+        <w:spacing w:before="60" w:after="60"/>
+        <w:ind w:left="720"/>
+        <w:rPr>
+          <w:lang w:val="pt-PT"/>
+        </w:rPr>
+      </w:pPr>
+      <w:proofErr w:type="gramStart"/>
+      <w:r>
+        <w:rPr>
+          <w:rFonts w:ascii="Courier New" w:eastAsia="Courier New" w:hAnsi="Courier New" w:cs="Courier New"/>
+          <w:color w:val="1F497D"/>
+          <w:sz w:val="18"/>
+          <w:szCs w:val="18"/>
+          <w:lang w:val="pt-PT"/>
+        </w:rPr>
+        <w:t>./</w:t>
+      </w:r>
+      <w:proofErr w:type="spellStart"/>
+      <w:proofErr w:type="gramEnd"/>
+      <w:r>
+        <w:rPr>
+          <w:rFonts w:ascii="Courier New" w:eastAsia="Courier New" w:hAnsi="Courier New" w:cs="Courier New"/>
+          <w:color w:val="1F497D"/>
+          <w:sz w:val="18"/>
+          <w:szCs w:val="18"/>
+          <w:lang w:val="pt-PT"/>
+        </w:rPr>
+        <w:t>command</w:t>
+      </w:r>
+      <w:proofErr w:type="spellEnd"/>
+      <w:r>
+        <w:rPr>
+          <w:rFonts w:ascii="Courier New" w:eastAsia="Courier New" w:hAnsi="Courier New" w:cs="Courier New"/>
+          <w:color w:val="1F497D"/>
+          <w:sz w:val="18"/>
+          <w:szCs w:val="18"/>
+          <w:lang w:val="pt-PT"/>
+        </w:rPr>
+        <w:t xml:space="preserve"> -s led -m </w:t>
+      </w:r>
+      <w:proofErr w:type="spellStart"/>
+      <w:r>
+        <w:rPr>
+          <w:rFonts w:ascii="Courier New" w:eastAsia="Courier New" w:hAnsi="Courier New" w:cs="Courier New"/>
+          <w:color w:val="1F497D"/>
+          <w:sz w:val="18"/>
+          <w:szCs w:val="18"/>
+          <w:lang w:val="pt-PT"/>
+        </w:rPr>
+        <w:t>on</w:t>
+      </w:r>
+      <w:proofErr w:type="spellEnd"/>
+      <w:r>
+        <w:rPr>
+          <w:rFonts w:ascii="Courier New" w:eastAsia="Courier New" w:hAnsi="Courier New" w:cs="Courier New"/>
+          <w:color w:val="1F497D"/>
+          <w:sz w:val="18"/>
+          <w:szCs w:val="18"/>
+          <w:lang w:val="pt-PT"/>
+        </w:rPr>
+        <w:t xml:space="preserve">    # Ligar o LED</w:t>
       </w:r>
     </w:p>
     <w:p>
@@ -3390,7 +3437,7 @@
           <w:szCs w:val="18"/>
           <w:lang w:val="en-US"/>
         </w:rPr>
-        <w:t xml:space="preserve">command -s led -m on    # </w:t>
+        <w:t xml:space="preserve">command -s led -m off   # </w:t>
       </w:r>
       <w:proofErr w:type="spellStart"/>
       <w:r>
@@ -3401,7 +3448,7 @@
           <w:szCs w:val="18"/>
           <w:lang w:val="en-US"/>
         </w:rPr>
-        <w:t>Ligar</w:t>
+        <w:t>Desligar</w:t>
       </w:r>
       <w:proofErr w:type="spellEnd"/>
       <w:r>
@@ -3420,41 +3467,35 @@
         <w:spacing w:before="60" w:after="60"/>
         <w:ind w:left="720"/>
         <w:rPr>
-          <w:lang w:val="en-US"/>
-        </w:rPr>
-      </w:pPr>
-      <w:proofErr w:type="gramStart"/>
-      <w:r>
-        <w:rPr>
           <w:rFonts w:ascii="Courier New" w:eastAsia="Courier New" w:hAnsi="Courier New" w:cs="Courier New"/>
           <w:color w:val="1F497D"/>
           <w:sz w:val="18"/>
           <w:szCs w:val="18"/>
-          <w:lang w:val="en-US"/>
-        </w:rPr>
-        <w:t>./</w:t>
-      </w:r>
-      <w:proofErr w:type="gramEnd"/>
+          <w:lang w:val="pt-PT"/>
+        </w:rPr>
+      </w:pPr>
+      <w:proofErr w:type="gramStart"/>
       <w:r>
         <w:rPr>
           <w:rFonts w:ascii="Courier New" w:eastAsia="Courier New" w:hAnsi="Courier New" w:cs="Courier New"/>
           <w:color w:val="1F497D"/>
           <w:sz w:val="18"/>
           <w:szCs w:val="18"/>
-          <w:lang w:val="en-US"/>
-        </w:rPr>
-        <w:t xml:space="preserve">command -s led -m off   # </w:t>
-      </w:r>
-      <w:proofErr w:type="spellStart"/>
+          <w:lang w:val="pt-PT"/>
+        </w:rPr>
+        <w:t>./</w:t>
+      </w:r>
+      <w:proofErr w:type="spellStart"/>
+      <w:proofErr w:type="gramEnd"/>
       <w:r>
         <w:rPr>
           <w:rFonts w:ascii="Courier New" w:eastAsia="Courier New" w:hAnsi="Courier New" w:cs="Courier New"/>
           <w:color w:val="1F497D"/>
           <w:sz w:val="18"/>
           <w:szCs w:val="18"/>
-          <w:lang w:val="en-US"/>
-        </w:rPr>
-        <w:t>Desligar</w:t>
+          <w:lang w:val="pt-PT"/>
+        </w:rPr>
+        <w:t>command</w:t>
       </w:r>
       <w:proofErr w:type="spellEnd"/>
       <w:r>
@@ -3463,20 +3504,10 @@
           <w:color w:val="1F497D"/>
           <w:sz w:val="18"/>
           <w:szCs w:val="18"/>
-          <w:lang w:val="en-US"/>
-        </w:rPr>
-        <w:t xml:space="preserve"> o LED</w:t>
-      </w:r>
-    </w:p>
-    <w:p>
-      <w:pPr>
-        <w:spacing w:before="60" w:after="60"/>
-        <w:ind w:left="720"/>
-        <w:rPr>
-          <w:lang w:val="pt-PT"/>
-        </w:rPr>
-      </w:pPr>
-      <w:proofErr w:type="gramStart"/>
+          <w:lang w:val="pt-PT"/>
+        </w:rPr>
+        <w:t xml:space="preserve"> -t 5 -s led     # Inverter </w:t>
+      </w:r>
       <w:r>
         <w:rPr>
           <w:rFonts w:ascii="Courier New" w:eastAsia="Courier New" w:hAnsi="Courier New" w:cs="Courier New"/>
@@ -3485,10 +3516,8 @@
           <w:szCs w:val="18"/>
           <w:lang w:val="pt-PT"/>
         </w:rPr>
-        <w:t>./</w:t>
-      </w:r>
-      <w:proofErr w:type="spellStart"/>
-      <w:proofErr w:type="gramEnd"/>
+        <w:t xml:space="preserve">estado </w:t>
+      </w:r>
       <w:r>
         <w:rPr>
           <w:rFonts w:ascii="Courier New" w:eastAsia="Courier New" w:hAnsi="Courier New" w:cs="Courier New"/>
@@ -3497,19 +3526,17 @@
           <w:szCs w:val="18"/>
           <w:lang w:val="pt-PT"/>
         </w:rPr>
-        <w:t>command</w:t>
-      </w:r>
-      <w:proofErr w:type="spellEnd"/>
-      <w:r>
-        <w:rPr>
-          <w:rFonts w:ascii="Courier New" w:eastAsia="Courier New" w:hAnsi="Courier New" w:cs="Courier New"/>
-          <w:color w:val="1F497D"/>
-          <w:sz w:val="18"/>
-          <w:szCs w:val="18"/>
-          <w:lang w:val="pt-PT"/>
-        </w:rPr>
-        <w:t xml:space="preserve"> -t 5 -s led     # Inverter durante 5 segundos</w:t>
-      </w:r>
+        <w:t>durante 5 segundos</w:t>
+      </w:r>
+    </w:p>
+    <w:p>
+      <w:pPr>
+        <w:spacing w:before="60" w:after="60"/>
+        <w:ind w:left="720"/>
+        <w:rPr>
+          <w:lang w:val="pt-PT"/>
+        </w:rPr>
+      </w:pPr>
     </w:p>
     <w:p>
       <w:pPr>
@@ -3548,7 +3575,6 @@
         <w:spacing w:before="60" w:after="60"/>
       </w:pPr>
       <w:r>
-        <w:lastRenderedPageBreak/>
         <w:t>Ligar o dispositivo (PC ou smartphone) à rede Wi-Fi "ESP32" com a senha "12345%".</w:t>
       </w:r>
     </w:p>
@@ -3581,6 +3607,9 @@
     <w:p>
       <w:pPr>
         <w:spacing w:before="60" w:after="60"/>
+        <w:rPr>
+          <w:lang w:val="pt-PT"/>
+        </w:rPr>
       </w:pPr>
     </w:p>
     <w:p>
@@ -4207,19 +4236,17 @@
     </w:p>
     <w:p>
       <w:pPr>
+        <w:pStyle w:val="PargrafodaLista"/>
+        <w:numPr>
+          <w:ilvl w:val="1"/>
+          <w:numId w:val="9"/>
+        </w:numPr>
         <w:spacing w:before="80" w:after="80"/>
-        <w:rPr>
-          <w:lang w:val="pt-PT"/>
-        </w:rPr>
-      </w:pPr>
-      <w:r>
-        <w:rPr>
-          <w:rFonts w:ascii="Arial" w:eastAsia="Arial" w:hAnsi="Arial" w:cs="Arial"/>
+      </w:pPr>
+      <w:r>
+        <w:rPr>
           <w:b/>
           <w:bCs/>
-          <w:sz w:val="22"/>
-          <w:szCs w:val="22"/>
-          <w:lang w:val="pt-PT"/>
         </w:rPr>
         <w:t>Interface Web (HTML embebido):</w:t>
       </w:r>
@@ -4361,12 +4388,6 @@
         <w:gridCol w:w="4000"/>
       </w:tblGrid>
       <w:tr>
-        <w:tblPrEx>
-          <w:tblCellMar>
-            <w:top w:w="0" w:type="dxa"/>
-            <w:bottom w:w="0" w:type="dxa"/>
-          </w:tblCellMar>
-        </w:tblPrEx>
         <w:tc>
           <w:tcPr>
             <w:tcW w:w="3000" w:type="dxa"/>
@@ -4393,6 +4414,7 @@
                 <w:bCs/>
                 <w:color w:val="FFFFFF"/>
               </w:rPr>
+              <w:lastRenderedPageBreak/>
               <w:t>Comando</w:t>
             </w:r>
             <w:proofErr w:type="spellEnd"/>
@@ -4480,12 +4502,6 @@
         </w:tc>
       </w:tr>
       <w:tr>
-        <w:tblPrEx>
-          <w:tblCellMar>
-            <w:top w:w="0" w:type="dxa"/>
-            <w:bottom w:w="0" w:type="dxa"/>
-          </w:tblCellMar>
-        </w:tblPrEx>
         <w:tc>
           <w:tcPr>
             <w:tcW w:w="3000" w:type="dxa"/>
@@ -4584,12 +4600,6 @@
         </w:tc>
       </w:tr>
       <w:tr>
-        <w:tblPrEx>
-          <w:tblCellMar>
-            <w:top w:w="0" w:type="dxa"/>
-            <w:bottom w:w="0" w:type="dxa"/>
-          </w:tblCellMar>
-        </w:tblPrEx>
         <w:tc>
           <w:tcPr>
             <w:tcW w:w="3000" w:type="dxa"/>
@@ -4620,7 +4630,6 @@
                 <w:szCs w:val="18"/>
                 <w:lang w:val="en-US"/>
               </w:rPr>
-              <w:lastRenderedPageBreak/>
               <w:t>./</w:t>
             </w:r>
             <w:proofErr w:type="gramEnd"/>
@@ -4697,12 +4706,6 @@
         </w:tc>
       </w:tr>
       <w:tr>
-        <w:tblPrEx>
-          <w:tblCellMar>
-            <w:top w:w="0" w:type="dxa"/>
-            <w:bottom w:w="0" w:type="dxa"/>
-          </w:tblCellMar>
-        </w:tblPrEx>
         <w:tc>
           <w:tcPr>
             <w:tcW w:w="3000" w:type="dxa"/>
@@ -5083,7 +5086,7 @@
         <w:spacing w:before="60" w:after="60"/>
         <w:ind w:left="720"/>
         <w:rPr>
-          <w:lang w:val="en-US"/>
+          <w:lang w:val="pt-PT"/>
         </w:rPr>
       </w:pPr>
       <w:r>
@@ -5092,69 +5095,71 @@
           <w:color w:val="1F497D"/>
           <w:sz w:val="18"/>
           <w:szCs w:val="18"/>
-          <w:lang w:val="en-US"/>
-        </w:rPr>
-        <w:t xml:space="preserve"># 1. </w:t>
-      </w:r>
-      <w:proofErr w:type="spellStart"/>
+          <w:lang w:val="pt-PT"/>
+        </w:rPr>
+        <w:t># 1. Ligar o LED</w:t>
+      </w:r>
+    </w:p>
+    <w:p>
+      <w:pPr>
+        <w:spacing w:before="60" w:after="60"/>
+        <w:ind w:left="720"/>
+        <w:rPr>
+          <w:lang w:val="pt-PT"/>
+        </w:rPr>
+      </w:pPr>
+      <w:proofErr w:type="gramStart"/>
       <w:r>
         <w:rPr>
           <w:rFonts w:ascii="Courier New" w:eastAsia="Courier New" w:hAnsi="Courier New" w:cs="Courier New"/>
           <w:color w:val="1F497D"/>
           <w:sz w:val="18"/>
           <w:szCs w:val="18"/>
-          <w:lang w:val="en-US"/>
-        </w:rPr>
-        <w:t>Ligar</w:t>
-      </w:r>
-      <w:proofErr w:type="spellEnd"/>
+          <w:lang w:val="pt-PT"/>
+        </w:rPr>
+        <w:t>./</w:t>
+      </w:r>
+      <w:proofErr w:type="spellStart"/>
+      <w:proofErr w:type="gramEnd"/>
       <w:r>
         <w:rPr>
           <w:rFonts w:ascii="Courier New" w:eastAsia="Courier New" w:hAnsi="Courier New" w:cs="Courier New"/>
           <w:color w:val="1F497D"/>
           <w:sz w:val="18"/>
           <w:szCs w:val="18"/>
-          <w:lang w:val="en-US"/>
-        </w:rPr>
-        <w:t xml:space="preserve"> o LED</w:t>
-      </w:r>
-    </w:p>
-    <w:p>
-      <w:pPr>
-        <w:spacing w:before="60" w:after="60"/>
-        <w:ind w:left="720"/>
-        <w:rPr>
-          <w:lang w:val="en-US"/>
-        </w:rPr>
-      </w:pPr>
-      <w:proofErr w:type="gramStart"/>
+          <w:lang w:val="pt-PT"/>
+        </w:rPr>
+        <w:t>command</w:t>
+      </w:r>
+      <w:proofErr w:type="spellEnd"/>
       <w:r>
         <w:rPr>
           <w:rFonts w:ascii="Courier New" w:eastAsia="Courier New" w:hAnsi="Courier New" w:cs="Courier New"/>
           <w:color w:val="1F497D"/>
           <w:sz w:val="18"/>
           <w:szCs w:val="18"/>
-          <w:lang w:val="en-US"/>
-        </w:rPr>
-        <w:t>./</w:t>
-      </w:r>
-      <w:proofErr w:type="gramEnd"/>
+          <w:lang w:val="pt-PT"/>
+        </w:rPr>
+        <w:t xml:space="preserve"> -s led -m </w:t>
+      </w:r>
+      <w:proofErr w:type="spellStart"/>
       <w:r>
         <w:rPr>
           <w:rFonts w:ascii="Courier New" w:eastAsia="Courier New" w:hAnsi="Courier New" w:cs="Courier New"/>
           <w:color w:val="1F497D"/>
           <w:sz w:val="18"/>
           <w:szCs w:val="18"/>
-          <w:lang w:val="en-US"/>
-        </w:rPr>
-        <w:t>command -s led -m on</w:t>
-      </w:r>
+          <w:lang w:val="pt-PT"/>
+        </w:rPr>
+        <w:t>on</w:t>
+      </w:r>
+      <w:proofErr w:type="spellEnd"/>
     </w:p>
     <w:p>
       <w:pPr>
         <w:spacing w:before="60" w:after="60"/>
         <w:rPr>
-          <w:lang w:val="en-US"/>
+          <w:lang w:val="pt-PT"/>
         </w:rPr>
       </w:pPr>
     </w:p>
@@ -5174,18 +5179,8 @@
           <w:szCs w:val="18"/>
           <w:lang w:val="pt-PT"/>
         </w:rPr>
-        <w:t># 2. Aguardar 3 segundos</w:t>
-      </w:r>
-    </w:p>
-    <w:p>
-      <w:pPr>
-        <w:spacing w:before="60" w:after="60"/>
-        <w:ind w:left="720"/>
-        <w:rPr>
-          <w:lang w:val="pt-PT"/>
-        </w:rPr>
-      </w:pPr>
-      <w:proofErr w:type="spellStart"/>
+        <w:t xml:space="preserve"># </w:t>
+      </w:r>
       <w:r>
         <w:rPr>
           <w:rFonts w:ascii="Courier New" w:eastAsia="Courier New" w:hAnsi="Courier New" w:cs="Courier New"/>
@@ -5194,9 +5189,8 @@
           <w:szCs w:val="18"/>
           <w:lang w:val="pt-PT"/>
         </w:rPr>
-        <w:t>sleep</w:t>
-      </w:r>
-      <w:proofErr w:type="spellEnd"/>
+        <w:t>2</w:t>
+      </w:r>
       <w:r>
         <w:rPr>
           <w:rFonts w:ascii="Courier New" w:eastAsia="Courier New" w:hAnsi="Courier New" w:cs="Courier New"/>
@@ -5205,16 +5199,8 @@
           <w:szCs w:val="18"/>
           <w:lang w:val="pt-PT"/>
         </w:rPr>
-        <w:t xml:space="preserve"> 3</w:t>
-      </w:r>
-    </w:p>
-    <w:p>
-      <w:pPr>
-        <w:spacing w:before="60" w:after="60"/>
-        <w:rPr>
-          <w:lang w:val="pt-PT"/>
-        </w:rPr>
-      </w:pPr>
+        <w:t>. Inverter o LED durante 5 segundos</w:t>
+      </w:r>
     </w:p>
     <w:p>
       <w:pPr>
@@ -5224,6 +5210,7 @@
           <w:lang w:val="pt-PT"/>
         </w:rPr>
       </w:pPr>
+      <w:proofErr w:type="gramStart"/>
       <w:r>
         <w:rPr>
           <w:rFonts w:ascii="Courier New" w:eastAsia="Courier New" w:hAnsi="Courier New" w:cs="Courier New"/>
@@ -5232,45 +5219,37 @@
           <w:szCs w:val="18"/>
           <w:lang w:val="pt-PT"/>
         </w:rPr>
-        <w:t># 3. Inverter o LED durante 5 segundos</w:t>
-      </w:r>
-    </w:p>
-    <w:p>
-      <w:pPr>
-        <w:spacing w:before="60" w:after="60"/>
-        <w:ind w:left="720"/>
-        <w:rPr>
-          <w:lang w:val="en-US"/>
-        </w:rPr>
-      </w:pPr>
-      <w:proofErr w:type="gramStart"/>
+        <w:t>./</w:t>
+      </w:r>
+      <w:proofErr w:type="spellStart"/>
+      <w:proofErr w:type="gramEnd"/>
       <w:r>
         <w:rPr>
           <w:rFonts w:ascii="Courier New" w:eastAsia="Courier New" w:hAnsi="Courier New" w:cs="Courier New"/>
           <w:color w:val="1F497D"/>
           <w:sz w:val="18"/>
           <w:szCs w:val="18"/>
-          <w:lang w:val="en-US"/>
-        </w:rPr>
-        <w:t>./</w:t>
-      </w:r>
-      <w:proofErr w:type="gramEnd"/>
+          <w:lang w:val="pt-PT"/>
+        </w:rPr>
+        <w:t>command</w:t>
+      </w:r>
+      <w:proofErr w:type="spellEnd"/>
       <w:r>
         <w:rPr>
           <w:rFonts w:ascii="Courier New" w:eastAsia="Courier New" w:hAnsi="Courier New" w:cs="Courier New"/>
           <w:color w:val="1F497D"/>
           <w:sz w:val="18"/>
           <w:szCs w:val="18"/>
-          <w:lang w:val="en-US"/>
-        </w:rPr>
-        <w:t>command -t 5 -s led</w:t>
+          <w:lang w:val="pt-PT"/>
+        </w:rPr>
+        <w:t xml:space="preserve"> -t 5 -s led</w:t>
       </w:r>
     </w:p>
     <w:p>
       <w:pPr>
         <w:spacing w:before="60" w:after="60"/>
         <w:rPr>
-          <w:lang w:val="en-US"/>
+          <w:lang w:val="pt-PT"/>
         </w:rPr>
       </w:pPr>
     </w:p>
@@ -5279,7 +5258,7 @@
         <w:spacing w:before="60" w:after="60"/>
         <w:ind w:left="720"/>
         <w:rPr>
-          <w:lang w:val="en-US"/>
+          <w:lang w:val="pt-PT"/>
         </w:rPr>
       </w:pPr>
       <w:r>
@@ -5288,31 +5267,29 @@
           <w:color w:val="1F497D"/>
           <w:sz w:val="18"/>
           <w:szCs w:val="18"/>
-          <w:lang w:val="en-US"/>
-        </w:rPr>
-        <w:t xml:space="preserve"># 4. </w:t>
-      </w:r>
-      <w:proofErr w:type="spellStart"/>
+          <w:lang w:val="pt-PT"/>
+        </w:rPr>
+        <w:t xml:space="preserve"># </w:t>
+      </w:r>
       <w:r>
         <w:rPr>
           <w:rFonts w:ascii="Courier New" w:eastAsia="Courier New" w:hAnsi="Courier New" w:cs="Courier New"/>
           <w:color w:val="1F497D"/>
           <w:sz w:val="18"/>
           <w:szCs w:val="18"/>
-          <w:lang w:val="en-US"/>
-        </w:rPr>
-        <w:t>Desligar</w:t>
-      </w:r>
-      <w:proofErr w:type="spellEnd"/>
+          <w:lang w:val="pt-PT"/>
+        </w:rPr>
+        <w:t>3</w:t>
+      </w:r>
       <w:r>
         <w:rPr>
           <w:rFonts w:ascii="Courier New" w:eastAsia="Courier New" w:hAnsi="Courier New" w:cs="Courier New"/>
           <w:color w:val="1F497D"/>
           <w:sz w:val="18"/>
           <w:szCs w:val="18"/>
-          <w:lang w:val="en-US"/>
-        </w:rPr>
-        <w:t xml:space="preserve"> o LED</w:t>
+          <w:lang w:val="pt-PT"/>
+        </w:rPr>
+        <w:t>. Desligar o LED</w:t>
       </w:r>
     </w:p>
     <w:p>
@@ -5382,6 +5359,9 @@
       <w:pPr>
         <w:spacing w:before="80" w:after="80"/>
         <w:rPr>
+          <w:rFonts w:ascii="Arial" w:eastAsia="Arial" w:hAnsi="Arial" w:cs="Arial"/>
+          <w:sz w:val="22"/>
+          <w:szCs w:val="22"/>
           <w:lang w:val="pt-PT"/>
         </w:rPr>
       </w:pPr>
@@ -5453,6 +5433,44 @@
           <w:lang w:val="pt-PT"/>
         </w:rPr>
         <w:t>, interpreta o comando e executa a ação correspondente sobre o GPIO 22.</w:t>
+      </w:r>
+    </w:p>
+    <w:p>
+      <w:pPr>
+        <w:spacing w:before="80" w:after="80"/>
+        <w:rPr>
+          <w:rFonts w:ascii="Arial" w:eastAsia="Arial" w:hAnsi="Arial" w:cs="Arial"/>
+          <w:sz w:val="22"/>
+          <w:szCs w:val="22"/>
+          <w:lang w:val="pt-PT"/>
+        </w:rPr>
+      </w:pPr>
+      <w:r>
+        <w:rPr>
+          <w:rFonts w:ascii="Arial" w:eastAsia="Arial" w:hAnsi="Arial" w:cs="Arial"/>
+          <w:sz w:val="22"/>
+          <w:szCs w:val="22"/>
+          <w:lang w:val="pt-PT"/>
+        </w:rPr>
+        <w:t>É importante colocar cada comando de cada vez. Copiar e colar vai fazer o ESP32 saltar passos, isto é, o LED ligaria e no instante a seguir inverteria o seu estado, desligando-o por 5 segundos</w:t>
+      </w:r>
+      <w:r>
+        <w:rPr>
+          <w:rFonts w:ascii="Arial" w:eastAsia="Arial" w:hAnsi="Arial" w:cs="Arial"/>
+          <w:sz w:val="22"/>
+          <w:szCs w:val="22"/>
+          <w:lang w:val="pt-PT"/>
+        </w:rPr>
+        <w:t>. Ao fim destes 5 segundos o led iria ligar, mas desligar no momento a seguir devido ao comando #3, impedindo</w:t>
+      </w:r>
+      <w:r>
+        <w:rPr>
+          <w:rFonts w:ascii="Arial" w:eastAsia="Arial" w:hAnsi="Arial" w:cs="Arial"/>
+          <w:sz w:val="22"/>
+          <w:szCs w:val="22"/>
+          <w:lang w:val="pt-PT"/>
+        </w:rPr>
+        <w:t xml:space="preserve"> a visualização do programa.</w:t>
       </w:r>
     </w:p>
     <w:p>
@@ -5524,6 +5542,7 @@
           <w:szCs w:val="26"/>
           <w:lang w:val="pt-PT"/>
         </w:rPr>
+        <w:lastRenderedPageBreak/>
         <w:t>5.2  Problema</w:t>
       </w:r>
       <w:proofErr w:type="gramEnd"/>
@@ -5565,7 +5584,6 @@
         <w:spacing w:before="60" w:after="60"/>
       </w:pPr>
       <w:r>
-        <w:lastRenderedPageBreak/>
         <w:t>Ligar à rede Wi-Fi "ESP32" (senha: 12345%) e aceder ao endereço IP do servidor (</w:t>
       </w:r>
       <w:proofErr w:type="spellStart"/>
@@ -6293,10 +6311,7 @@
       </w:pPr>
       <w:bookmarkStart w:id="7" w:name="_Toc227578172"/>
       <w:r>
-        <w:t>6</w:t>
-      </w:r>
-      <w:r>
-        <w:t xml:space="preserve">.   </w:t>
+        <w:t xml:space="preserve">6.   </w:t>
       </w:r>
       <w:proofErr w:type="spellStart"/>
       <w:r>
@@ -6315,10 +6330,7 @@
       </w:r>
       <w:proofErr w:type="gramEnd"/>
       <w:r>
-        <w:t xml:space="preserve"> section challenges students to do something different, to solve a specific problem, using the core technology/tool of this lab script; some hints may be provided, but not the (re)solution, which may be unveiled afterwards (e.g. one week later) or upo</w:t>
-      </w:r>
-      <w:r>
-        <w:t>n explicit solicitation from students that unsuccessfully attempted to solve the problem)</w:t>
+        <w:t xml:space="preserve"> section challenges students to do something different, to solve a specific problem, using the core technology/tool of this lab script; some hints may be provided, but not the (re)solution, which may be unveiled afterwards (e.g. one week later) or upon explicit solicitation from students that unsuccessfully attempted to solve the problem)</w:t>
       </w:r>
     </w:p>
     <w:p>
@@ -6328,10 +6340,7 @@
       </w:pPr>
       <w:bookmarkStart w:id="8" w:name="_Toc227578173"/>
       <w:r>
-        <w:t>7</w:t>
-      </w:r>
-      <w:r>
-        <w:t xml:space="preserve">.  </w:t>
+        <w:t xml:space="preserve">7.  </w:t>
       </w:r>
       <w:proofErr w:type="spellStart"/>
       <w:r>
@@ -6342,13 +6351,11 @@
     </w:p>
     <w:p>
       <w:r>
-        <w:t>(here you should list all the bibliography that has been used as a base for writing this document and that have been effectively referenced in the tex</w:t>
-      </w:r>
-      <w:r>
-        <w:t>t; the students are motivated to use referencing software such as the one embedded in MS Word, Mendeley, Zotero, Endnote, or any other of your choice; try to favour scientific-</w:t>
-      </w:r>
-      <w:proofErr w:type="spellStart"/>
-      <w:r>
+        <w:t>(here you should list all the bibliography that has been used as a base for writing this document and that have been effectively referenced in the text; the students are motivated to use referencing software such as the one embedded in MS Word, Mendeley, Zotero, Endnote, or any other of your choice; try to favour scientific-</w:t>
+      </w:r>
+      <w:proofErr w:type="spellStart"/>
+      <w:r>
+        <w:lastRenderedPageBreak/>
         <w:t>tecnological</w:t>
       </w:r>
       <w:proofErr w:type="spellEnd"/>
@@ -6361,10 +6368,7 @@
       </w:r>
       <w:proofErr w:type="spellEnd"/>
       <w:r>
-        <w:t xml:space="preserve"> (or at least “truste</w:t>
-      </w:r>
-      <w:r>
-        <w:t>d”) conferences and journals; both survey/position and research papers may be cited; avoid citing web sites, unless they hold web-apps or alike).</w:t>
+        <w:t xml:space="preserve"> (or at least “trusted”) conferences and journals; both survey/position and research papers may be cited; avoid citing web sites, unless they hold web-apps or alike).</w:t>
       </w:r>
     </w:p>
     <w:p>
@@ -6374,11 +6378,7 @@
       <w:bookmarkStart w:id="9" w:name="_Toc227578174"/>
       <w:proofErr w:type="spellStart"/>
       <w:r>
-        <w:lastRenderedPageBreak/>
-        <w:t>A</w:t>
-      </w:r>
-      <w:r>
-        <w:t>nexos</w:t>
+        <w:t>Anexos</w:t>
       </w:r>
       <w:bookmarkEnd w:id="9"/>
       <w:proofErr w:type="spellEnd"/>
@@ -6393,10 +6393,7 @@
       </w:r>
       <w:proofErr w:type="gramEnd"/>
       <w:r>
-        <w:t xml:space="preserve"> you should include any technical documentation that you consider relevant for supporting the lab </w:t>
-      </w:r>
-      <w:r>
-        <w:t>script but does not “fit into”, as you feel it would jeopardize the reading flow of the core text)</w:t>
+        <w:t xml:space="preserve"> you should include any technical documentation that you consider relevant for supporting the lab script but does not “fit into”, as you feel it would jeopardize the reading flow of the core text)</w:t>
       </w:r>
     </w:p>
     <w:sectPr>
@@ -7069,6 +7066,92 @@
     </w:lvl>
   </w:abstractNum>
   <w:abstractNum w:abstractNumId="5" w15:restartNumberingAfterBreak="0">
+    <w:nsid w:val="58580208"/>
+    <w:multiLevelType w:val="hybridMultilevel"/>
+    <w:tmpl w:val="37AA0602"/>
+    <w:lvl w:ilvl="0" w:tplc="0816000F">
+      <w:start w:val="1"/>
+      <w:numFmt w:val="decimal"/>
+      <w:lvlText w:val="%1."/>
+      <w:lvlJc w:val="left"/>
+      <w:pPr>
+        <w:ind w:left="720" w:hanging="360"/>
+      </w:pPr>
+    </w:lvl>
+    <w:lvl w:ilvl="1" w:tplc="08160019" w:tentative="1">
+      <w:start w:val="1"/>
+      <w:numFmt w:val="lowerLetter"/>
+      <w:lvlText w:val="%2."/>
+      <w:lvlJc w:val="left"/>
+      <w:pPr>
+        <w:ind w:left="1440" w:hanging="360"/>
+      </w:pPr>
+    </w:lvl>
+    <w:lvl w:ilvl="2" w:tplc="0816001B" w:tentative="1">
+      <w:start w:val="1"/>
+      <w:numFmt w:val="lowerRoman"/>
+      <w:lvlText w:val="%3."/>
+      <w:lvlJc w:val="right"/>
+      <w:pPr>
+        <w:ind w:left="2160" w:hanging="180"/>
+      </w:pPr>
+    </w:lvl>
+    <w:lvl w:ilvl="3" w:tplc="0816000F" w:tentative="1">
+      <w:start w:val="1"/>
+      <w:numFmt w:val="decimal"/>
+      <w:lvlText w:val="%4."/>
+      <w:lvlJc w:val="left"/>
+      <w:pPr>
+        <w:ind w:left="2880" w:hanging="360"/>
+      </w:pPr>
+    </w:lvl>
+    <w:lvl w:ilvl="4" w:tplc="08160019" w:tentative="1">
+      <w:start w:val="1"/>
+      <w:numFmt w:val="lowerLetter"/>
+      <w:lvlText w:val="%5."/>
+      <w:lvlJc w:val="left"/>
+      <w:pPr>
+        <w:ind w:left="3600" w:hanging="360"/>
+      </w:pPr>
+    </w:lvl>
+    <w:lvl w:ilvl="5" w:tplc="0816001B" w:tentative="1">
+      <w:start w:val="1"/>
+      <w:numFmt w:val="lowerRoman"/>
+      <w:lvlText w:val="%6."/>
+      <w:lvlJc w:val="right"/>
+      <w:pPr>
+        <w:ind w:left="4320" w:hanging="180"/>
+      </w:pPr>
+    </w:lvl>
+    <w:lvl w:ilvl="6" w:tplc="0816000F" w:tentative="1">
+      <w:start w:val="1"/>
+      <w:numFmt w:val="decimal"/>
+      <w:lvlText w:val="%7."/>
+      <w:lvlJc w:val="left"/>
+      <w:pPr>
+        <w:ind w:left="5040" w:hanging="360"/>
+      </w:pPr>
+    </w:lvl>
+    <w:lvl w:ilvl="7" w:tplc="08160019" w:tentative="1">
+      <w:start w:val="1"/>
+      <w:numFmt w:val="lowerLetter"/>
+      <w:lvlText w:val="%8."/>
+      <w:lvlJc w:val="left"/>
+      <w:pPr>
+        <w:ind w:left="5760" w:hanging="360"/>
+      </w:pPr>
+    </w:lvl>
+    <w:lvl w:ilvl="8" w:tplc="0816001B" w:tentative="1">
+      <w:start w:val="1"/>
+      <w:numFmt w:val="lowerRoman"/>
+      <w:lvlText w:val="%9."/>
+      <w:lvlJc w:val="right"/>
+      <w:pPr>
+        <w:ind w:left="6480" w:hanging="180"/>
+      </w:pPr>
+    </w:lvl>
+  </w:abstractNum>
+  <w:abstractNum w:abstractNumId="6" w15:restartNumberingAfterBreak="0">
     <w:nsid w:val="5D280CA2"/>
     <w:multiLevelType w:val="multilevel"/>
     <w:tmpl w:val="C5469A7C"/>
@@ -7154,7 +7237,129 @@
       </w:pPr>
     </w:lvl>
   </w:abstractNum>
-  <w:abstractNum w:abstractNumId="6" w15:restartNumberingAfterBreak="0">
+  <w:abstractNum w:abstractNumId="7" w15:restartNumberingAfterBreak="0">
+    <w:nsid w:val="6691269B"/>
+    <w:multiLevelType w:val="multilevel"/>
+    <w:tmpl w:val="6EAAF834"/>
+    <w:lvl w:ilvl="0">
+      <w:start w:val="4"/>
+      <w:numFmt w:val="decimal"/>
+      <w:lvlText w:val="%1"/>
+      <w:lvlJc w:val="left"/>
+      <w:pPr>
+        <w:ind w:left="360" w:hanging="360"/>
+      </w:pPr>
+      <w:rPr>
+        <w:rFonts w:hint="default"/>
+        <w:b/>
+      </w:rPr>
+    </w:lvl>
+    <w:lvl w:ilvl="1">
+      <w:start w:val="2"/>
+      <w:numFmt w:val="decimal"/>
+      <w:lvlText w:val="%1.%2"/>
+      <w:lvlJc w:val="left"/>
+      <w:pPr>
+        <w:ind w:left="720" w:hanging="720"/>
+      </w:pPr>
+      <w:rPr>
+        <w:rFonts w:hint="default"/>
+        <w:b/>
+      </w:rPr>
+    </w:lvl>
+    <w:lvl w:ilvl="2">
+      <w:start w:val="1"/>
+      <w:numFmt w:val="decimal"/>
+      <w:lvlText w:val="%1.%2.%3"/>
+      <w:lvlJc w:val="left"/>
+      <w:pPr>
+        <w:ind w:left="720" w:hanging="720"/>
+      </w:pPr>
+      <w:rPr>
+        <w:rFonts w:hint="default"/>
+        <w:b/>
+      </w:rPr>
+    </w:lvl>
+    <w:lvl w:ilvl="3">
+      <w:start w:val="1"/>
+      <w:numFmt w:val="decimal"/>
+      <w:lvlText w:val="%1.%2.%3.%4"/>
+      <w:lvlJc w:val="left"/>
+      <w:pPr>
+        <w:ind w:left="1080" w:hanging="1080"/>
+      </w:pPr>
+      <w:rPr>
+        <w:rFonts w:hint="default"/>
+        <w:b/>
+      </w:rPr>
+    </w:lvl>
+    <w:lvl w:ilvl="4">
+      <w:start w:val="1"/>
+      <w:numFmt w:val="decimal"/>
+      <w:lvlText w:val="%1.%2.%3.%4.%5"/>
+      <w:lvlJc w:val="left"/>
+      <w:pPr>
+        <w:ind w:left="1440" w:hanging="1440"/>
+      </w:pPr>
+      <w:rPr>
+        <w:rFonts w:hint="default"/>
+        <w:b/>
+      </w:rPr>
+    </w:lvl>
+    <w:lvl w:ilvl="5">
+      <w:start w:val="1"/>
+      <w:numFmt w:val="decimal"/>
+      <w:lvlText w:val="%1.%2.%3.%4.%5.%6"/>
+      <w:lvlJc w:val="left"/>
+      <w:pPr>
+        <w:ind w:left="1440" w:hanging="1440"/>
+      </w:pPr>
+      <w:rPr>
+        <w:rFonts w:hint="default"/>
+        <w:b/>
+      </w:rPr>
+    </w:lvl>
+    <w:lvl w:ilvl="6">
+      <w:start w:val="1"/>
+      <w:numFmt w:val="decimal"/>
+      <w:lvlText w:val="%1.%2.%3.%4.%5.%6.%7"/>
+      <w:lvlJc w:val="left"/>
+      <w:pPr>
+        <w:ind w:left="1800" w:hanging="1800"/>
+      </w:pPr>
+      <w:rPr>
+        <w:rFonts w:hint="default"/>
+        <w:b/>
+      </w:rPr>
+    </w:lvl>
+    <w:lvl w:ilvl="7">
+      <w:start w:val="1"/>
+      <w:numFmt w:val="decimal"/>
+      <w:lvlText w:val="%1.%2.%3.%4.%5.%6.%7.%8"/>
+      <w:lvlJc w:val="left"/>
+      <w:pPr>
+        <w:ind w:left="2160" w:hanging="2160"/>
+      </w:pPr>
+      <w:rPr>
+        <w:rFonts w:hint="default"/>
+        <w:b/>
+      </w:rPr>
+    </w:lvl>
+    <w:lvl w:ilvl="8">
+      <w:start w:val="1"/>
+      <w:numFmt w:val="decimal"/>
+      <w:lvlText w:val="%1.%2.%3.%4.%5.%6.%7.%8.%9"/>
+      <w:lvlJc w:val="left"/>
+      <w:pPr>
+        <w:ind w:left="2160" w:hanging="2160"/>
+      </w:pPr>
+      <w:rPr>
+        <w:rFonts w:hint="default"/>
+        <w:b/>
+      </w:rPr>
+    </w:lvl>
+  </w:abstractNum>
+  <w:abstractNum w:abstractNumId="8" w15:restartNumberingAfterBreak="0">
     <w:nsid w:val="7079204A"/>
     <w:multiLevelType w:val="hybridMultilevel"/>
     <w:tmpl w:val="F648BF7A"/>
@@ -7212,10 +7417,10 @@
     <w:abstractNumId w:val="2"/>
   </w:num>
   <w:num w:numId="2">
-    <w:abstractNumId w:val="5"/>
+    <w:abstractNumId w:val="6"/>
   </w:num>
   <w:num w:numId="3">
-    <w:abstractNumId w:val="6"/>
+    <w:abstractNumId w:val="8"/>
     <w:lvlOverride w:ilvl="0">
       <w:startOverride w:val="1"/>
     </w:lvlOverride>
@@ -7231,6 +7436,12 @@
   </w:num>
   <w:num w:numId="7">
     <w:abstractNumId w:val="3"/>
+  </w:num>
+  <w:num w:numId="8">
+    <w:abstractNumId w:val="5"/>
+  </w:num>
+  <w:num w:numId="9">
+    <w:abstractNumId w:val="7"/>
   </w:num>
 </w:numbering>
 </file>

</xml_diff>